<commit_message>
Write abstract pseudocode for recursive Abstract Syntax Tree construction algorithm.
</commit_message>
<xml_diff>
--- a/Documents/AnalyseFonctionnelle/Raphael Arseneault Analyse fonctionnelle et organique.docx
+++ b/Documents/AnalyseFonctionnelle/Raphael Arseneault Analyse fonctionnelle et organique.docx
@@ -1454,19 +1454,30 @@
     </w:p>
     <w:p>
       <w:pPr>
-        <w:pStyle w:val="730"/>
         <w:pBdr/>
         <w:spacing/>
         <w:ind/>
         <w:rPr>
-          <w:lang w:val="fr-FR"/>
+          <w:highlight w:val="none"/>
+          <w:lang w:val="fr-FR" w:bidi="fr-FR"/>
         </w:rPr>
       </w:pPr>
       <w:r>
         <w:rPr>
-          <w:lang w:val="fr-FR"/>
+          <w:lang w:val="fr-FR" w:bidi="fr-FR"/>
         </w:rPr>
-        <w:t xml:space="preserve">Exemple de livrable</w:t>
+        <w:t xml:space="preserve">Pseudo code</w:t>
+      </w:r>
+      <w:r>
+        <w:rPr>
+          <w:lang w:val="fr-FR" w:bidi="fr-FR"/>
+        </w:rPr>
+        <w:t xml:space="preserve"> des algorithmes critiques</w:t>
+      </w:r>
+      <w:r>
+        <w:rPr>
+          <w:lang w:val="fr-FR" w:bidi="fr-FR"/>
+        </w:rPr>
       </w:r>
       <w:r>
         <w:rPr>
@@ -1480,213 +1491,1283 @@
         <w:spacing/>
         <w:ind/>
         <w:rPr>
-          <w:lang w:val="fr-FR"/>
+          <w:highlight w:val="none"/>
+          <w:lang w:val="fr-FR" w:bidi="fr-FR"/>
         </w:rPr>
       </w:pPr>
       <w:r>
         <w:rPr>
-          <w:lang w:val="fr-FR"/>
+          <w:highlight w:val="none"/>
+          <w:lang w:val="fr-FR" w:bidi="fr-FR"/>
         </w:rPr>
-        <w:t xml:space="preserve">Lorem ipsum dolor sit amet, consectetuer adipiscing elit. Maecenas porttitor congue massa. Fusce posuere, magna sed pulvinar ultricies, purus lectus malesuada libero, sit amet commodo magna eros quis urna. Nunc viverra imperdiet enim. Fusce est.</w:t>
+        <w:t xml:space="preserve">Algorithme de construction de l’arbre syntaxique abstrait récursif. </w:t>
       </w:r>
       <w:r>
         <w:rPr>
-          <w:lang w:val="fr-FR"/>
+          <w:highlight w:val="none"/>
+          <w:lang w:val="fr-FR" w:bidi="fr-FR"/>
         </w:rPr>
       </w:r>
     </w:p>
     <w:p>
       <w:pPr>
         <w:pBdr/>
+        <w:shd w:val="nil"/>
         <w:spacing/>
         <w:ind/>
         <w:rPr>
-          <w:lang w:val="fr-FR"/>
+          <w:highlight w:val="none"/>
+          <w:lang w:val="fr-FR" w:bidi="fr-FR"/>
         </w:rPr>
       </w:pPr>
       <w:r>
         <w:rPr>
-          <w:lang w:val="fr-FR"/>
+          <w:highlight w:val="none"/>
+          <w:lang w:val="fr-FR" w:bidi="fr-FR"/>
         </w:rPr>
-        <w:t xml:space="preserve">Vivamus a tellus. Pellentesque habitant morbi tristique senectus et netus et malesuada fames ac turpis egestas. Proin pharetra nonummy pede. Mauris et orci. Aenean nec lorem.</w:t>
+        <w:br w:type="page" w:clear="all"/>
       </w:r>
       <w:r>
         <w:rPr>
-          <w:lang w:val="fr-FR"/>
-        </w:rPr>
-      </w:r>
-    </w:p>
-    <w:p>
-      <w:pPr>
-        <w:pBdr/>
-        <w:spacing/>
-        <w:ind/>
-        <w:rPr>
-          <w:lang w:val="fr-FR"/>
-        </w:rPr>
-      </w:pPr>
-      <w:r>
-        <w:rPr>
-          <w:lang w:val="fr-FR"/>
-        </w:rPr>
-        <w:t xml:space="preserve">In porttitor. Donec laoreet nonummy augue. Suspendisse dui purus, scelerisque at, vulputate vitae, pretium mattis, nunc. Mauris eget neque at sem venenatis eleifend. Ut nonummy.</w:t>
-      </w:r>
-      <w:r>
-        <w:rPr>
-          <w:lang w:val="fr-FR"/>
-        </w:rPr>
-      </w:r>
-    </w:p>
-    <w:p>
-      <w:pPr>
-        <w:pBdr/>
-        <w:spacing/>
-        <w:ind/>
-        <w:rPr>
-          <w:lang w:val="fr-FR"/>
-        </w:rPr>
-      </w:pPr>
-      <w:r>
-        <w:rPr>
-          <w:lang w:val="fr-FR"/>
-        </w:rPr>
-        <w:t xml:space="preserve">Fusce aliquet pede non pede. </w:t>
-      </w:r>
-      <w:r>
-        <w:rPr>
-          <w:lang w:val="fr-FR"/>
-        </w:rPr>
-        <w:t xml:space="preserve">Suspendisse dapibus lorem pellentesque magna. Integer nulla. Donec blandit feugiat ligula. Donec hendrerit, felis et imperdiet euismod, purus ipsum pretium metus, in lacinia nulla nisl eget sapien.</w:t>
-      </w:r>
-      <w:r>
-        <w:rPr>
-          <w:lang w:val="fr-FR"/>
-        </w:rPr>
-      </w:r>
-    </w:p>
-    <w:p>
-      <w:pPr>
-        <w:pBdr/>
-        <w:spacing/>
-        <w:ind/>
-        <w:rPr>
-          <w:lang w:val="fr-FR"/>
-        </w:rPr>
-      </w:pPr>
-      <w:r>
-        <w:rPr>
-          <w:lang w:val="fr-FR"/>
-        </w:rPr>
-        <w:t xml:space="preserve">Donec ut est in lectus consequat consequat. Etiam eget dui. Aliquam erat volutpat. Sed at lorem in nunc porta tristique. Proin nec augue.</w:t>
-      </w:r>
-      <w:r>
-        <w:rPr>
-          <w:lang w:val="fr-FR"/>
-        </w:rPr>
-      </w:r>
-    </w:p>
-    <w:p>
-      <w:pPr>
-        <w:pStyle w:val="731"/>
-        <w:pBdr/>
-        <w:spacing/>
-        <w:ind/>
-        <w:rPr>
-          <w:lang w:val="fr-FR"/>
-        </w:rPr>
-      </w:pPr>
-      <w:r>
-        <w:rPr>
-          <w:lang w:val="fr-FR"/>
-        </w:rPr>
-        <w:t xml:space="preserve">Diagramme X</w:t>
-      </w:r>
-      <w:r>
-        <w:rPr>
-          <w:lang w:val="fr-FR"/>
-        </w:rPr>
-        <mc:AlternateContent>
-          <mc:Choice Requires="wpg">
-            <w:drawing>
-              <wp:inline xmlns:wp="http://schemas.openxmlformats.org/drawingml/2006/wordprocessingDrawing" distT="0" distB="0" distL="0" distR="0">
-                <wp:extent cx="5943600" cy="3342691"/>
-                <wp:effectExtent l="0" t="0" r="19050" b="10160"/>
-                <wp:docPr id="3" name="Rectangle 1"/>
-                <wp:cNvGraphicFramePr/>
-                <a:graphic xmlns:a="http://schemas.openxmlformats.org/drawingml/2006/main">
-                  <a:graphicData uri="http://schemas.microsoft.com/office/word/2010/wordprocessingShape">
-                    <wps:wsp>
-                      <wps:cNvPr id="0" name=""/>
-                      <wps:cNvSpPr/>
-                      <wps:spPr bwMode="auto">
-                        <a:xfrm>
-                          <a:off x="0" y="0"/>
-                          <a:ext cx="5943600" cy="3342691"/>
-                        </a:xfrm>
-                        <a:prstGeom prst="rect">
-                          <a:avLst/>
-                        </a:prstGeom>
-                      </wps:spPr>
-                      <wps:style>
-                        <a:lnRef idx="2">
-                          <a:schemeClr val="accent1">
-                            <a:shade val="15000"/>
-                          </a:schemeClr>
-                        </a:lnRef>
-                        <a:fillRef idx="1">
-                          <a:schemeClr val="accent1"/>
-                        </a:fillRef>
-                        <a:effectRef idx="0">
-                          <a:schemeClr val="accent1"/>
-                        </a:effectRef>
-                        <a:fontRef idx="minor">
-                          <a:schemeClr val="lt1"/>
-                        </a:fontRef>
-                      </wps:style>
-                      <wps:bodyPr rot="0">
-                        <a:prstTxWarp prst="textNoShape">
-                          <a:avLst/>
-                        </a:prstTxWarp>
-                        <a:noAutofit/>
-                      </wps:bodyPr>
-                    </wps:wsp>
-                  </a:graphicData>
-                </a:graphic>
-              </wp:inline>
-            </w:drawing>
-          </mc:Choice>
-          <mc:Fallback>
-            <w:pict>
-              <v:shape id="shape 2" o:spid="_x0000_s2" o:spt="1" type="#_x0000_t1" style="width:468.00pt;height:263.20pt;mso-wrap-distance-left:0.00pt;mso-wrap-distance-top:0.00pt;mso-wrap-distance-right:0.00pt;mso-wrap-distance-bottom:0.00pt;visibility:visible;" fillcolor="#156082" strokecolor="#030E13" strokeweight="1.00pt">
-                <v:stroke dashstyle="solid"/>
-              </v:shape>
-            </w:pict>
-          </mc:Fallback>
-        </mc:AlternateContent>
-      </w:r>
-      <w:r>
-        <w:rPr>
-          <w:lang w:val="fr-FR"/>
-        </w:rPr>
-      </w:r>
-    </w:p>
-    <w:p>
-      <w:pPr>
-        <w:pBdr/>
-        <w:spacing/>
-        <w:ind/>
-        <w:rPr>
-          <w:lang w:val="fr-FR"/>
-        </w:rPr>
-      </w:pPr>
-      <w:r>
-        <w:rPr>
+          <w:highlight w:val="none"/>
           <w:lang w:val="fr-FR" w:bidi="fr-FR"/>
         </w:rPr>
       </w:r>
       <w:r>
         <w:rPr>
+          <w:highlight w:val="none"/>
+          <w:lang w:val="fr-FR" w:bidi="fr-FR"/>
+        </w:rPr>
+      </w:r>
+    </w:p>
+    <w:p>
+      <w:pPr>
+        <w:pBdr/>
+        <w:spacing/>
+        <w:ind/>
+        <w:rPr>
+          <w:highlight w:val="none"/>
+          <w:lang w:val="fr-FR" w:bidi="fr-FR"/>
+        </w:rPr>
+      </w:pPr>
+      <w:r>
+        <w:rPr>
+          <w:highlight w:val="none"/>
+          <w:lang w:val="fr-FR" w:bidi="fr-FR"/>
+        </w:rPr>
+        <w:t xml:space="preserve">// algorithme pour atteindre le dernier token d’une instruction</w:t>
+      </w:r>
+      <w:r>
+        <w:rPr>
+          <w:highlight w:val="none"/>
+          <w:lang w:val="fr-FR" w:bidi="fr-FR"/>
+        </w:rPr>
+        <w:t xml:space="preserve"> c’est pour obtenir un intervale entre deux nombre et envoyer cette intervale au enfant pour le traiter</w:t>
+      </w:r>
+      <w:r>
+        <w:rPr>
+          <w:highlight w:val="none"/>
+          <w:lang w:val="fr-FR" w:bidi="fr-FR"/>
+        </w:rPr>
+      </w:r>
+    </w:p>
+    <w:p>
+      <w:pPr>
+        <w:pBdr/>
+        <w:spacing/>
+        <w:ind/>
+        <w:rPr>
+          <w:highlight w:val="none"/>
+          <w:lang w:val="fr-FR" w:bidi="fr-FR"/>
+        </w:rPr>
+      </w:pPr>
+      <w:r>
+        <w:rPr>
+          <w:highlight w:val="none"/>
+          <w:lang w:val="fr-FR" w:bidi="fr-FR"/>
+        </w:rPr>
+        <w:t xml:space="preserve">int avancerFinInstruction(int indexActuelle)</w:t>
+      </w:r>
+      <w:r>
+        <w:rPr>
+          <w:highlight w:val="none"/>
+          <w:lang w:val="fr-FR" w:bidi="fr-FR"/>
+        </w:rPr>
+      </w:r>
+    </w:p>
+    <w:p>
+      <w:pPr>
+        <w:pBdr/>
+        <w:spacing/>
+        <w:ind/>
+        <w:rPr>
+          <w:highlight w:val="none"/>
+          <w:lang w:val="fr-FR" w:bidi="fr-FR"/>
+        </w:rPr>
+      </w:pPr>
+      <w:r>
+        <w:rPr>
+          <w:highlight w:val="none"/>
+          <w:lang w:val="fr-FR" w:bidi="fr-FR"/>
+        </w:rPr>
+        <w:t xml:space="preserve">{</w:t>
+        <w:tab/>
+      </w:r>
+      <w:r>
+        <w:rPr>
+          <w:highlight w:val="none"/>
+          <w:lang w:val="fr-FR" w:bidi="fr-FR"/>
+        </w:rPr>
+      </w:r>
+    </w:p>
+    <w:p>
+      <w:pPr>
+        <w:pBdr/>
+        <w:spacing/>
+        <w:ind/>
+        <w:rPr>
+          <w:highlight w:val="none"/>
+          <w:lang w:val="fr-FR" w:bidi="fr-FR"/>
+        </w:rPr>
+      </w:pPr>
+      <w:r>
+        <w:rPr>
+          <w:highlight w:val="none"/>
+          <w:lang w:val="fr-FR" w:bidi="fr-FR"/>
+        </w:rPr>
+        <w:tab/>
+        <w:t xml:space="preserve">int i = indexActuelle ; </w:t>
+      </w:r>
+      <w:r>
+        <w:rPr>
+          <w:highlight w:val="none"/>
+          <w:lang w:val="fr-FR" w:bidi="fr-FR"/>
+        </w:rPr>
+      </w:r>
+      <w:r>
+        <w:rPr>
+          <w:highlight w:val="none"/>
+          <w:lang w:val="fr-FR" w:bidi="fr-FR"/>
+        </w:rPr>
+      </w:r>
+      <w:r>
+        <w:rPr>
+          <w:highlight w:val="none"/>
+          <w:lang w:val="fr-FR" w:bidi="fr-FR"/>
+        </w:rPr>
+      </w:r>
+      <w:r>
+        <w:rPr>
+          <w:highlight w:val="none"/>
+          <w:lang w:val="fr-FR" w:bidi="fr-FR"/>
+        </w:rPr>
+      </w:r>
+    </w:p>
+    <w:p>
+      <w:pPr>
+        <w:pBdr/>
+        <w:spacing/>
+        <w:ind w:left="709"/>
+        <w:rPr>
+          <w:highlight w:val="none"/>
+          <w:lang w:val="fr-FR" w:bidi="fr-FR"/>
+        </w:rPr>
+      </w:pPr>
+      <w:r>
+        <w:rPr>
+          <w:highlight w:val="none"/>
+          <w:lang w:val="fr-FR" w:bidi="fr-FR"/>
+        </w:rPr>
+        <w:tab/>
+      </w:r>
+      <w:r>
+        <w:rPr>
+          <w:highlight w:val="none"/>
+          <w:lang w:val="fr-FR" w:bidi="fr-FR"/>
+        </w:rPr>
+        <w:t xml:space="preserve">Tant que (token type n’est pas </w:t>
+      </w:r>
+      <w:r>
+        <w:rPr>
+          <w:highlight w:val="none"/>
+          <w:lang w:val="fr-FR" w:bidi="fr-FR"/>
+        </w:rPr>
+        <w:t xml:space="preserve">à la fin d’une instruction indiqué par un ; on continue ; ) </w:t>
+      </w:r>
+      <w:r/>
+      <w:r>
+        <w:rPr>
+          <w:highlight w:val="none"/>
+          <w:lang w:val="fr-FR" w:bidi="fr-FR"/>
+        </w:rPr>
+      </w:r>
+      <w:r>
+        <w:rPr>
+          <w:highlight w:val="none"/>
+          <w:lang w:val="fr-FR" w:bidi="fr-FR"/>
+        </w:rPr>
+      </w:r>
+      <w:r>
+        <w:rPr>
+          <w:highlight w:val="none"/>
+          <w:lang w:val="fr-FR" w:bidi="fr-FR"/>
+        </w:rPr>
+      </w:r>
+      <w:r>
+        <w:rPr>
+          <w:highlight w:val="none"/>
+          <w:lang w:val="fr-FR" w:bidi="fr-FR"/>
+        </w:rPr>
+      </w:r>
+    </w:p>
+    <w:p>
+      <w:pPr>
+        <w:pBdr/>
+        <w:spacing/>
+        <w:ind w:left="709"/>
+        <w:rPr>
+          <w:highlight w:val="none"/>
+          <w:lang w:val="fr-FR" w:bidi="fr-FR"/>
+        </w:rPr>
+      </w:pPr>
+      <w:r>
+        <w:rPr>
+          <w:highlight w:val="none"/>
+          <w:lang w:val="fr-FR" w:bidi="fr-FR"/>
+        </w:rPr>
+        <w:t xml:space="preserve">{</w:t>
+      </w:r>
+      <w:r>
+        <w:rPr>
+          <w:highlight w:val="none"/>
+          <w:lang w:val="fr-FR" w:bidi="fr-FR"/>
+        </w:rPr>
+      </w:r>
+    </w:p>
+    <w:p>
+      <w:pPr>
+        <w:pBdr/>
+        <w:spacing/>
+        <w:ind w:left="709"/>
+        <w:rPr>
+          <w:highlight w:val="none"/>
+          <w:lang w:val="fr-FR" w:bidi="fr-FR"/>
+        </w:rPr>
+      </w:pPr>
+      <w:r>
+        <w:rPr>
+          <w:highlight w:val="none"/>
+          <w:lang w:val="fr-FR" w:bidi="fr-FR"/>
+        </w:rPr>
+        <w:tab/>
+        <w:tab/>
+      </w:r>
+      <w:r>
+        <w:rPr>
+          <w:highlight w:val="none"/>
+          <w:lang w:val="fr-FR" w:bidi="fr-FR"/>
+        </w:rPr>
+        <w:t xml:space="preserve">indexActuelle ++</w:t>
+      </w:r>
+      <w:r/>
+      <w:r>
+        <w:rPr>
+          <w:highlight w:val="none"/>
+          <w:lang w:val="fr-FR" w:bidi="fr-FR"/>
+        </w:rPr>
+        <w:t xml:space="preserve"> ;</w:t>
+      </w:r>
+      <w:r>
+        <w:rPr>
+          <w:highlight w:val="none"/>
+          <w:lang w:val="fr-FR" w:bidi="fr-FR"/>
+        </w:rPr>
+      </w:r>
+      <w:r>
+        <w:rPr>
+          <w:highlight w:val="none"/>
+          <w:lang w:val="fr-FR" w:bidi="fr-FR"/>
+        </w:rPr>
+      </w:r>
+    </w:p>
+    <w:p>
+      <w:pPr>
+        <w:pBdr/>
+        <w:spacing/>
+        <w:ind w:left="709"/>
+        <w:rPr>
+          <w:highlight w:val="none"/>
+          <w:lang w:val="fr-FR" w:bidi="fr-FR"/>
+        </w:rPr>
+      </w:pPr>
+      <w:r>
+        <w:rPr>
+          <w:highlight w:val="none"/>
+          <w:lang w:val="fr-FR" w:bidi="fr-FR"/>
+        </w:rPr>
+        <w:t xml:space="preserve">}</w:t>
+      </w:r>
+      <w:r>
+        <w:rPr>
+          <w:highlight w:val="none"/>
+          <w:lang w:val="fr-FR" w:bidi="fr-FR"/>
+        </w:rPr>
+      </w:r>
+      <w:r>
+        <w:rPr>
+          <w:highlight w:val="none"/>
+          <w:lang w:val="fr-FR" w:bidi="fr-FR"/>
+        </w:rPr>
+      </w:r>
+      <w:r>
+        <w:rPr>
+          <w:highlight w:val="none"/>
+          <w:lang w:val="fr-FR" w:bidi="fr-FR"/>
+        </w:rPr>
+        <w:tab/>
+        <w:tab/>
+      </w:r>
+      <w:r>
+        <w:rPr>
+          <w:highlight w:val="none"/>
+          <w:lang w:val="fr-FR" w:bidi="fr-FR"/>
+        </w:rPr>
+      </w:r>
+      <w:r>
+        <w:rPr>
+          <w:highlight w:val="none"/>
+          <w:lang w:val="fr-FR" w:bidi="fr-FR"/>
+        </w:rPr>
+      </w:r>
+    </w:p>
+    <w:p>
+      <w:pPr>
+        <w:pBdr/>
+        <w:spacing/>
+        <w:ind w:left="709"/>
+        <w:rPr>
+          <w:highlight w:val="none"/>
+          <w:lang w:val="fr-FR" w:bidi="fr-FR"/>
+        </w:rPr>
+      </w:pPr>
+      <w:r>
+        <w:rPr>
+          <w:highlight w:val="none"/>
+          <w:lang w:val="fr-FR" w:bidi="fr-FR"/>
+        </w:rPr>
+        <w:t xml:space="preserve">return indexActuelle ;</w:t>
+      </w:r>
+      <w:r>
+        <w:rPr>
+          <w:highlight w:val="none"/>
+          <w:lang w:val="fr-FR" w:bidi="fr-FR"/>
+        </w:rPr>
+      </w:r>
+      <w:r>
+        <w:rPr>
+          <w:highlight w:val="none"/>
+          <w:lang w:val="fr-FR" w:bidi="fr-FR"/>
+        </w:rPr>
+      </w:r>
+      <w:r>
+        <w:rPr>
+          <w:highlight w:val="none"/>
+          <w:lang w:val="fr-FR" w:bidi="fr-FR"/>
+        </w:rPr>
+      </w:r>
+      <w:r>
+        <w:rPr>
+          <w:highlight w:val="none"/>
+          <w:lang w:val="fr-FR" w:bidi="fr-FR"/>
+        </w:rPr>
+      </w:r>
+      <w:r>
+        <w:rPr>
+          <w:highlight w:val="none"/>
+          <w:lang w:val="fr-FR" w:bidi="fr-FR"/>
+        </w:rPr>
+      </w:r>
+      <w:r>
+        <w:rPr>
+          <w:highlight w:val="none"/>
+          <w:lang w:val="fr-FR" w:bidi="fr-FR"/>
+        </w:rPr>
+      </w:r>
+    </w:p>
+    <w:p>
+      <w:pPr>
+        <w:pBdr/>
+        <w:spacing/>
+        <w:ind/>
+        <w:rPr>
+          <w:highlight w:val="none"/>
+          <w:lang w:val="fr-FR" w:bidi="fr-FR"/>
+        </w:rPr>
+      </w:pPr>
+      <w:r>
+        <w:rPr>
+          <w:highlight w:val="none"/>
+          <w:lang w:val="fr-FR" w:bidi="fr-FR"/>
+        </w:rPr>
+        <w:t xml:space="preserve">}</w:t>
+      </w:r>
+      <w:r>
+        <w:rPr>
+          <w:highlight w:val="none"/>
+          <w:lang w:val="fr-FR" w:bidi="fr-FR"/>
+        </w:rPr>
+      </w:r>
+    </w:p>
+    <w:p>
+      <w:pPr>
+        <w:pBdr/>
+        <w:shd w:val="nil"/>
+        <w:spacing/>
+        <w:ind/>
+        <w:rPr>
+          <w:highlight w:val="none"/>
+          <w:lang w:val="fr-FR" w:bidi="fr-FR"/>
+        </w:rPr>
+      </w:pPr>
+      <w:r>
+        <w:rPr>
+          <w:highlight w:val="none"/>
+          <w:lang w:val="fr-FR" w:bidi="fr-FR"/>
+        </w:rPr>
+        <w:br w:type="page" w:clear="all"/>
+      </w:r>
+      <w:r>
+        <w:rPr>
+          <w:highlight w:val="none"/>
+          <w:lang w:val="fr-FR" w:bidi="fr-FR"/>
+        </w:rPr>
+      </w:r>
+      <w:r>
+        <w:rPr>
+          <w:highlight w:val="none"/>
+          <w:lang w:val="fr-FR" w:bidi="fr-FR"/>
+        </w:rPr>
+      </w:r>
+    </w:p>
+    <w:p>
+      <w:pPr>
+        <w:pBdr/>
+        <w:shd w:val="nil" w:color="000000"/>
+        <w:spacing/>
+        <w:ind/>
+        <w:rPr/>
+      </w:pPr>
+      <w:r>
+        <w:rPr>
+          <w:highlight w:val="none"/>
+          <w:lang w:val="fr-FR" w:bidi="fr-FR"/>
+        </w:rPr>
+        <w:t xml:space="preserve">vecteur&lt;INoeud&gt; obtenirTouteInstructionEnfant(vecteur&lt;Token&gt; tokensIntervalle)</w:t>
+      </w:r>
+      <w:r/>
+    </w:p>
+    <w:p>
+      <w:pPr>
+        <w:pBdr/>
+        <w:shd w:val="nil" w:color="000000"/>
+        <w:spacing/>
+        <w:ind/>
+        <w:rPr/>
+      </w:pPr>
+      <w:r>
+        <w:rPr>
+          <w:highlight w:val="none"/>
+          <w:lang w:val="fr-FR" w:bidi="fr-FR"/>
+        </w:rPr>
+        <w:t xml:space="preserve">{</w:t>
+      </w:r>
+      <w:r/>
+    </w:p>
+    <w:p>
+      <w:pPr>
+        <w:pBdr/>
+        <w:shd w:val="nil" w:color="000000"/>
+        <w:spacing/>
+        <w:ind/>
+        <w:rPr/>
+      </w:pPr>
+      <w:r>
+        <w:rPr>
+          <w:highlight w:val="none"/>
+          <w:lang w:val="fr-FR" w:bidi="fr-FR"/>
+        </w:rPr>
+        <w:tab/>
+        <w:t xml:space="preserve">vecteur&lt;INoeud&gt; listeEnfants ;</w:t>
+      </w:r>
+      <w:r/>
+    </w:p>
+    <w:p>
+      <w:pPr>
+        <w:pBdr/>
+        <w:shd w:val="nil" w:color="000000"/>
+        <w:spacing/>
+        <w:ind/>
+        <w:rPr/>
+      </w:pPr>
+      <w:r>
+        <w:rPr>
+          <w:highlight w:val="none"/>
+          <w:lang w:val="fr-FR" w:bidi="fr-FR"/>
+        </w:rPr>
+        <w:tab/>
+        <w:t xml:space="preserve">int indexLocal = 0 ;</w:t>
+      </w:r>
+      <w:r/>
+    </w:p>
+    <w:p>
+      <w:pPr>
+        <w:pBdr/>
+        <w:shd w:val="nil" w:color="000000"/>
+        <w:spacing/>
+        <w:ind/>
+        <w:rPr/>
+      </w:pPr>
+      <w:r>
+        <w:rPr>
+          <w:highlight w:val="none"/>
+          <w:lang w:val="fr-FR" w:bidi="fr-FR"/>
+        </w:rPr>
+      </w:r>
+      <w:r/>
+    </w:p>
+    <w:p>
+      <w:pPr>
+        <w:pBdr/>
+        <w:shd w:val="nil" w:color="000000"/>
+        <w:spacing/>
+        <w:ind/>
+        <w:rPr/>
+      </w:pPr>
+      <w:r>
+        <w:rPr>
+          <w:highlight w:val="none"/>
+          <w:lang w:val="fr-FR" w:bidi="fr-FR"/>
+        </w:rPr>
+        <w:tab/>
+        <w:t xml:space="preserve">// On parcourt l'intervalle du début (0) jusqu'à la fin de la tranche</w:t>
+      </w:r>
+      <w:r/>
+    </w:p>
+    <w:p>
+      <w:pPr>
+        <w:pBdr/>
+        <w:shd w:val="nil" w:color="000000"/>
+        <w:spacing/>
+        <w:ind/>
+        <w:rPr/>
+      </w:pPr>
+      <w:r>
+        <w:rPr>
+          <w:highlight w:val="none"/>
+          <w:lang w:val="fr-FR" w:bidi="fr-FR"/>
+        </w:rPr>
+        <w:tab/>
+        <w:t xml:space="preserve">Tant que (indexLocal &lt; tokensIntervalle.taille()) </w:t>
+      </w:r>
+      <w:r/>
+    </w:p>
+    <w:p>
+      <w:pPr>
+        <w:pBdr/>
+        <w:shd w:val="nil" w:color="000000"/>
+        <w:spacing/>
+        <w:ind/>
+        <w:rPr/>
+      </w:pPr>
+      <w:r>
+        <w:rPr>
+          <w:highlight w:val="none"/>
+          <w:lang w:val="fr-FR" w:bidi="fr-FR"/>
+        </w:rPr>
+        <w:tab/>
+        <w:t xml:space="preserve">{</w:t>
+      </w:r>
+      <w:r/>
+    </w:p>
+    <w:p>
+      <w:pPr>
+        <w:pBdr/>
+        <w:shd w:val="nil" w:color="000000"/>
+        <w:spacing/>
+        <w:ind/>
+        <w:rPr/>
+      </w:pPr>
+      <w:r>
+        <w:rPr>
+          <w:highlight w:val="none"/>
+          <w:lang w:val="fr-FR" w:bidi="fr-FR"/>
+        </w:rPr>
+        <w:tab/>
+        <w:tab/>
+        <w:t xml:space="preserve">// on construit l'arbre pour chaque instruction trouvée dans l'intervalle de façon récursif </w:t>
+      </w:r>
+      <w:r/>
+    </w:p>
+    <w:p>
+      <w:pPr>
+        <w:pBdr/>
+        <w:shd w:val="nil" w:color="000000"/>
+        <w:spacing/>
+        <w:ind/>
+        <w:rPr/>
+      </w:pPr>
+      <w:r>
+        <w:rPr>
+          <w:highlight w:val="none"/>
+          <w:lang w:val="fr-FR" w:bidi="fr-FR"/>
+        </w:rPr>
+        <w:tab/>
+        <w:tab/>
+        <w:t xml:space="preserve">// L’ index local est passé par référence, donc il avance automatiquement à chaque appel</w:t>
+      </w:r>
+      <w:r/>
+    </w:p>
+    <w:p>
+      <w:pPr>
+        <w:pBdr/>
+        <w:shd w:val="nil" w:color="000000"/>
+        <w:spacing/>
+        <w:ind/>
+        <w:rPr/>
+      </w:pPr>
+      <w:r>
+        <w:rPr>
+          <w:highlight w:val="none"/>
+          <w:lang w:val="fr-FR" w:bidi="fr-FR"/>
+        </w:rPr>
+        <w:tab/>
+        <w:tab/>
+        <w:t xml:space="preserve">INoeud enfant = construireArbreSyntaxique(tokensIntervalle, indexLocal) ;</w:t>
+      </w:r>
+      <w:r/>
+      <w:r>
+        <w:rPr>
+          <w:highlight w:val="none"/>
+          <w:lang w:val="fr-FR" w:bidi="fr-FR"/>
+        </w:rPr>
+      </w:r>
+      <w:r/>
+      <w:r>
+        <w:rPr>
+          <w:highlight w:val="none"/>
+          <w:lang w:val="fr-FR" w:bidi="fr-FR"/>
+        </w:rPr>
+      </w:r>
+    </w:p>
+    <w:p>
+      <w:pPr>
+        <w:pBdr/>
+        <w:shd w:val="nil" w:color="000000"/>
+        <w:spacing/>
+        <w:ind/>
+        <w:rPr/>
+      </w:pPr>
+      <w:r>
+        <w:rPr>
+          <w:highlight w:val="none"/>
+          <w:lang w:val="fr-FR" w:bidi="fr-FR"/>
+        </w:rPr>
+        <w:tab/>
+        <w:tab/>
+        <w:t xml:space="preserve">listeEnfants.ajouter(enfant) ;</w:t>
+      </w:r>
+      <w:r/>
+    </w:p>
+    <w:p>
+      <w:pPr>
+        <w:pBdr/>
+        <w:shd w:val="nil" w:color="000000"/>
+        <w:spacing/>
+        <w:ind/>
+        <w:rPr/>
+      </w:pPr>
+      <w:r>
+        <w:rPr>
+          <w:highlight w:val="none"/>
+          <w:lang w:val="fr-FR" w:bidi="fr-FR"/>
+        </w:rPr>
+        <w:tab/>
+        <w:t xml:space="preserve">}</w:t>
+      </w:r>
+      <w:r/>
+      <w:r>
+        <w:rPr>
+          <w:highlight w:val="none"/>
+          <w:lang w:val="fr-FR" w:bidi="fr-FR"/>
+        </w:rPr>
+      </w:r>
+      <w:r/>
+      <w:r>
+        <w:rPr>
+          <w:highlight w:val="none"/>
+          <w:lang w:val="fr-FR" w:bidi="fr-FR"/>
+        </w:rPr>
+      </w:r>
+    </w:p>
+    <w:p>
+      <w:pPr>
+        <w:pBdr/>
+        <w:shd w:val="nil" w:color="000000"/>
+        <w:spacing/>
+        <w:ind/>
+        <w:rPr/>
+      </w:pPr>
+      <w:r>
+        <w:rPr>
+          <w:highlight w:val="none"/>
+          <w:lang w:val="fr-FR" w:bidi="fr-FR"/>
+        </w:rPr>
+        <w:tab/>
+        <w:t xml:space="preserve">return listeEnfants ;</w:t>
+      </w:r>
+      <w:r/>
+    </w:p>
+    <w:p>
+      <w:pPr>
+        <w:pBdr/>
+        <w:shd w:val="nil"/>
+        <w:spacing/>
+        <w:ind/>
+        <w:rPr>
+          <w:highlight w:val="none"/>
+          <w:lang w:val="fr-FR" w:bidi="fr-FR"/>
+        </w:rPr>
+      </w:pPr>
+      <w:r>
+        <w:rPr>
+          <w:highlight w:val="none"/>
+          <w:lang w:val="fr-FR" w:bidi="fr-FR"/>
+        </w:rPr>
+        <w:t xml:space="preserve">}</w:t>
+      </w:r>
+      <w:r/>
+      <w:r>
+        <w:rPr>
+          <w:highlight w:val="none"/>
+          <w:lang w:val="fr-FR" w:bidi="fr-FR"/>
+        </w:rPr>
+        <w:br w:type="page" w:clear="all"/>
+      </w:r>
+      <w:r>
+        <w:rPr>
+          <w:highlight w:val="none"/>
+          <w:lang w:val="fr-FR" w:bidi="fr-FR"/>
+        </w:rPr>
+      </w:r>
+      <w:r>
+        <w:rPr>
+          <w:highlight w:val="none"/>
+          <w:lang w:val="fr-FR" w:bidi="fr-FR"/>
+        </w:rPr>
+      </w:r>
+    </w:p>
+    <w:p>
+      <w:pPr>
+        <w:pBdr/>
+        <w:spacing/>
+        <w:ind/>
+        <w:rPr>
+          <w:highlight w:val="none"/>
+          <w:lang w:val="fr-FR" w:bidi="fr-FR"/>
+        </w:rPr>
+      </w:pPr>
+      <w:r>
+        <w:rPr>
+          <w:highlight w:val="none"/>
+          <w:lang w:val="fr-FR" w:bidi="fr-FR"/>
+        </w:rPr>
+      </w:r>
+      <w:r>
+        <w:rPr>
+          <w:highlight w:val="none"/>
+          <w:lang w:val="fr-FR" w:bidi="fr-FR"/>
+        </w:rPr>
+      </w:r>
+      <w:r>
+        <w:rPr>
+          <w:highlight w:val="none"/>
+          <w:lang w:val="fr-FR" w:bidi="fr-FR"/>
+        </w:rPr>
+      </w:r>
+    </w:p>
+    <w:p>
+      <w:pPr>
+        <w:pBdr/>
+        <w:spacing/>
+        <w:ind/>
+        <w:rPr>
+          <w:highlight w:val="none"/>
+          <w:lang w:val="fr-FR" w:bidi="fr-FR"/>
+        </w:rPr>
+      </w:pPr>
+      <w:r>
+        <w:rPr>
+          <w:highlight w:val="none"/>
+          <w:lang w:val="fr-FR" w:bidi="fr-FR"/>
+        </w:rPr>
+        <w:t xml:space="preserve">INoeud construireArbreSyntaxique(vecteur&lt;Token&gt; tokens)</w:t>
+      </w:r>
+      <w:r>
+        <w:rPr>
+          <w:highlight w:val="none"/>
+          <w:lang w:val="fr-FR" w:bidi="fr-FR"/>
+        </w:rPr>
+      </w:r>
+    </w:p>
+    <w:p>
+      <w:pPr>
+        <w:pBdr/>
+        <w:spacing/>
+        <w:ind/>
+        <w:rPr>
+          <w:highlight w:val="none"/>
+          <w:lang w:val="fr-FR" w:bidi="fr-FR"/>
+        </w:rPr>
+      </w:pPr>
+      <w:r>
+        <w:rPr>
+          <w:highlight w:val="none"/>
+          <w:lang w:val="fr-FR" w:bidi="fr-FR"/>
+        </w:rPr>
+        <w:t xml:space="preserve">{</w:t>
+        <w:tab/>
+      </w:r>
+      <w:r>
+        <w:rPr>
+          <w:highlight w:val="none"/>
+          <w:lang w:val="fr-FR" w:bidi="fr-FR"/>
+        </w:rPr>
+      </w:r>
+      <w:r>
+        <w:rPr>
+          <w:highlight w:val="none"/>
+          <w:lang w:val="fr-FR" w:bidi="fr-FR"/>
+        </w:rPr>
+      </w:r>
+      <w:r>
+        <w:rPr>
+          <w:highlight w:val="none"/>
+          <w:lang w:val="fr-FR" w:bidi="fr-FR"/>
+        </w:rPr>
+      </w:r>
+      <w:r>
+        <w:rPr>
+          <w:highlight w:val="none"/>
+          <w:lang w:val="fr-FR" w:bidi="fr-FR"/>
+        </w:rPr>
+      </w:r>
+    </w:p>
+    <w:p>
+      <w:pPr>
+        <w:pBdr/>
+        <w:spacing/>
+        <w:ind/>
+        <w:rPr>
+          <w:highlight w:val="none"/>
+          <w:lang w:val="fr-FR" w:bidi="fr-FR"/>
+        </w:rPr>
+      </w:pPr>
+      <w:r>
+        <w:rPr>
+          <w:highlight w:val="none"/>
+          <w:lang w:val="fr-FR" w:bidi="fr-FR"/>
+        </w:rPr>
+        <w:tab/>
+        <w:t xml:space="preserve">// Registre d’instruction contenant une lamda de construction de noeud</w:t>
+      </w:r>
+      <w:r>
+        <w:rPr>
+          <w:highlight w:val="none"/>
+          <w:lang w:val="fr-FR" w:bidi="fr-FR"/>
+        </w:rPr>
+        <w:t xml:space="preserve"> stocké dans un dictionnaire, retourne un noeud </w:t>
+      </w:r>
+      <w:r>
+        <w:rPr>
+          <w:highlight w:val="none"/>
+          <w:lang w:val="fr-FR" w:bidi="fr-FR"/>
+        </w:rPr>
+      </w:r>
+    </w:p>
+    <w:p>
+      <w:pPr>
+        <w:pBdr/>
+        <w:spacing/>
+        <w:ind/>
+        <w:rPr>
+          <w:highlight w:val="none"/>
+          <w:lang w:val="fr-FR" w:bidi="fr-FR"/>
+        </w:rPr>
+      </w:pPr>
+      <w:r>
+        <w:rPr>
+          <w:highlight w:val="none"/>
+          <w:lang w:val="fr-FR" w:bidi="fr-FR"/>
+        </w:rPr>
+        <w:tab/>
+        <w:t xml:space="preserve">noeuds = </w:t>
+      </w:r>
+      <w:r>
+        <w:rPr>
+          <w:highlight w:val="none"/>
+          <w:lang w:val="fr-FR" w:bidi="fr-FR"/>
+        </w:rPr>
+        <w:t xml:space="preserve"> registreInstruction.recuperer(</w:t>
+      </w:r>
+      <w:r>
+        <w:rPr>
+          <w:highlight w:val="none"/>
+          <w:lang w:val="fr-FR" w:bidi="fr-FR"/>
+        </w:rPr>
+        <w:t xml:space="preserve">tokens</w:t>
+      </w:r>
+      <w:r>
+        <w:rPr>
+          <w:highlight w:val="none"/>
+          <w:lang w:val="fr-FR" w:bidi="fr-FR"/>
+        </w:rPr>
+        <w:t xml:space="preserve">[index].type) ;</w:t>
+      </w:r>
+      <w:r>
+        <w:rPr>
+          <w:highlight w:val="none"/>
+          <w:lang w:val="fr-FR" w:bidi="fr-FR"/>
+        </w:rPr>
+      </w:r>
+      <w:r>
+        <w:rPr>
+          <w:highlight w:val="none"/>
+          <w:lang w:val="fr-FR" w:bidi="fr-FR"/>
+        </w:rPr>
+      </w:r>
+    </w:p>
+    <w:p>
+      <w:pPr>
+        <w:pBdr/>
+        <w:spacing/>
+        <w:ind/>
+        <w:rPr>
+          <w:highlight w:val="none"/>
+          <w:lang w:val="fr-FR" w:bidi="fr-FR"/>
+        </w:rPr>
+      </w:pPr>
+      <w:r>
+        <w:rPr>
+          <w:highlight w:val="none"/>
+          <w:lang w:val="fr-FR" w:bidi="fr-FR"/>
+        </w:rPr>
+        <w:tab/>
+        <w:t xml:space="preserve">// Récupérer un vecteur de noeud enfant</w:t>
+      </w:r>
+      <w:r>
+        <w:rPr>
+          <w:highlight w:val="none"/>
+          <w:lang w:val="fr-FR" w:bidi="fr-FR"/>
+        </w:rPr>
+      </w:r>
+    </w:p>
+    <w:p>
+      <w:pPr>
+        <w:pBdr/>
+        <w:spacing/>
+        <w:ind/>
+        <w:rPr>
+          <w:highlight w:val="none"/>
+          <w:lang w:val="fr-FR" w:bidi="fr-FR"/>
+        </w:rPr>
+      </w:pPr>
+      <w:r>
+        <w:rPr>
+          <w:highlight w:val="none"/>
+          <w:lang w:val="fr-FR" w:bidi="fr-FR"/>
+        </w:rPr>
+        <w:tab/>
+        <w:t xml:space="preserve">vecteur&lt;noeud&gt; enfants = obtenirTouteInstructionEnfant()</w:t>
+      </w:r>
+      <w:r>
+        <w:rPr>
+          <w:highlight w:val="none"/>
+          <w:lang w:val="fr-FR" w:bidi="fr-FR"/>
+        </w:rPr>
+      </w:r>
+      <w:r>
+        <w:rPr>
+          <w:highlight w:val="none"/>
+          <w:lang w:val="fr-FR" w:bidi="fr-FR"/>
+        </w:rPr>
+      </w:r>
+    </w:p>
+    <w:p>
+      <w:pPr>
+        <w:pBdr/>
+        <w:spacing/>
+        <w:ind/>
+        <w:rPr>
+          <w:highlight w:val="none"/>
+          <w:lang w:val="fr-FR" w:bidi="fr-FR"/>
+        </w:rPr>
+      </w:pPr>
+      <w:r>
+        <w:rPr>
+          <w:highlight w:val="none"/>
+          <w:lang w:val="fr-FR" w:bidi="fr-FR"/>
+        </w:rPr>
+      </w:r>
+      <w:r>
+        <w:rPr>
+          <w:highlight w:val="none"/>
+          <w:lang w:val="fr-FR" w:bidi="fr-FR"/>
+        </w:rPr>
+        <w:tab/>
+        <w:t xml:space="preserve">// Ajouter les noeud </w:t>
+      </w:r>
+      <w:r>
+        <w:rPr>
+          <w:highlight w:val="none"/>
+          <w:lang w:val="fr-FR" w:bidi="fr-FR"/>
+        </w:rPr>
+        <w:t xml:space="preserve">à l’arbre syntaxique abstrait</w:t>
+      </w:r>
+      <w:r>
+        <w:rPr>
+          <w:highlight w:val="none"/>
+          <w:lang w:val="fr-FR" w:bidi="fr-FR"/>
+        </w:rPr>
+      </w:r>
+      <w:r>
+        <w:rPr>
+          <w:highlight w:val="none"/>
+          <w:lang w:val="fr-FR" w:bidi="fr-FR"/>
+        </w:rPr>
+      </w:r>
+      <w:r>
+        <w:rPr>
+          <w:highlight w:val="none"/>
+          <w:lang w:val="fr-FR" w:bidi="fr-FR"/>
+        </w:rPr>
+      </w:r>
+      <w:r>
+        <w:rPr>
+          <w:highlight w:val="none"/>
+          <w:lang w:val="fr-FR" w:bidi="fr-FR"/>
+        </w:rPr>
+      </w:r>
+    </w:p>
+    <w:p>
+      <w:pPr>
+        <w:pBdr/>
+        <w:spacing/>
+        <w:ind/>
+        <w:rPr>
+          <w:highlight w:val="none"/>
+          <w:lang w:val="fr-FR" w:bidi="fr-FR"/>
+        </w:rPr>
+      </w:pPr>
+      <w:r>
+        <w:rPr>
+          <w:highlight w:val="none"/>
+          <w:lang w:val="fr-FR" w:bidi="fr-FR"/>
+        </w:rPr>
+        <w:tab/>
+        <w:t xml:space="preserve">noeuds.</w:t>
+      </w:r>
+      <w:r>
+        <w:rPr>
+          <w:highlight w:val="none"/>
+          <w:lang w:val="fr-FR" w:bidi="fr-FR"/>
+        </w:rPr>
+        <w:t xml:space="preserve">ajouterInstruction(enfants)</w:t>
+      </w:r>
+      <w:r>
+        <w:rPr>
+          <w:highlight w:val="none"/>
+          <w:lang w:val="fr-FR" w:bidi="fr-FR"/>
+        </w:rPr>
+      </w:r>
+      <w:r>
+        <w:rPr>
+          <w:highlight w:val="none"/>
+          <w:lang w:val="fr-FR" w:bidi="fr-FR"/>
+        </w:rPr>
+      </w:r>
+      <w:r>
+        <w:rPr>
+          <w:highlight w:val="none"/>
+          <w:lang w:val="fr-FR" w:bidi="fr-FR"/>
+        </w:rPr>
+        <w:tab/>
+      </w:r>
+      <w:r>
+        <w:rPr>
+          <w:highlight w:val="none"/>
+          <w:lang w:val="fr-FR" w:bidi="fr-FR"/>
+        </w:rPr>
+      </w:r>
+      <w:r>
+        <w:rPr>
+          <w:highlight w:val="none"/>
+          <w:lang w:val="fr-FR" w:bidi="fr-FR"/>
+        </w:rPr>
+      </w:r>
+      <w:r>
+        <w:rPr>
+          <w:highlight w:val="none"/>
+          <w:lang w:val="fr-FR" w:bidi="fr-FR"/>
+        </w:rPr>
+      </w:r>
+      <w:r>
+        <w:rPr>
+          <w:highlight w:val="none"/>
+          <w:lang w:val="fr-FR" w:bidi="fr-FR"/>
+        </w:rPr>
+        <w:tab/>
+      </w:r>
+      <w:r>
+        <w:rPr>
+          <w:highlight w:val="none"/>
+          <w:lang w:val="fr-FR" w:bidi="fr-FR"/>
+        </w:rPr>
+      </w:r>
+      <w:r>
+        <w:rPr>
+          <w:highlight w:val="none"/>
+          <w:lang w:val="fr-FR" w:bidi="fr-FR"/>
+        </w:rPr>
+      </w:r>
+      <w:r>
+        <w:rPr>
+          <w:highlight w:val="none"/>
+          <w:lang w:val="fr-FR" w:bidi="fr-FR"/>
+        </w:rPr>
+      </w:r>
+      <w:r>
+        <w:rPr>
+          <w:highlight w:val="none"/>
+          <w:lang w:val="fr-FR" w:bidi="fr-FR"/>
+        </w:rPr>
+      </w:r>
+    </w:p>
+    <w:p>
+      <w:pPr>
+        <w:pBdr/>
+        <w:spacing/>
+        <w:ind/>
+        <w:rPr>
+          <w:highlight w:val="none"/>
+          <w:lang w:val="fr-FR" w:bidi="fr-FR"/>
+        </w:rPr>
+      </w:pPr>
+      <w:r>
+        <w:rPr>
+          <w:highlight w:val="none"/>
+          <w:lang w:val="fr-FR" w:bidi="fr-FR"/>
+        </w:rPr>
+        <w:tab/>
+        <w:t xml:space="preserve">return </w:t>
+      </w:r>
+      <w:r>
+        <w:rPr>
+          <w:highlight w:val="none"/>
+          <w:lang w:val="fr-FR" w:bidi="fr-FR"/>
+        </w:rPr>
+        <w:t xml:space="preserve">noeuds ; </w:t>
+      </w:r>
+      <w:r>
+        <w:rPr>
+          <w:highlight w:val="none"/>
+          <w:lang w:val="fr-FR" w:bidi="fr-FR"/>
+        </w:rPr>
+      </w:r>
+    </w:p>
+    <w:p>
+      <w:pPr>
+        <w:pBdr/>
+        <w:spacing/>
+        <w:ind/>
+        <w:rPr>
+          <w:highlight w:val="none"/>
+          <w:lang w:val="fr-FR" w:bidi="fr-FR"/>
+        </w:rPr>
+      </w:pPr>
+      <w:r>
+        <w:rPr>
+          <w:highlight w:val="none"/>
+          <w:lang w:val="fr-FR" w:bidi="fr-FR"/>
+        </w:rPr>
+        <w:t xml:space="preserve">}</w:t>
+      </w:r>
+      <w:r>
+        <w:rPr>
+          <w:highlight w:val="none"/>
+          <w:lang w:val="fr-FR" w:bidi="fr-FR"/>
+        </w:rPr>
+      </w:r>
+      <w:r>
+        <w:rPr>
+          <w:highlight w:val="none"/>
+          <w:lang w:val="fr-FR" w:bidi="fr-FR"/>
+        </w:rPr>
+      </w:r>
+    </w:p>
+    <w:p>
+      <w:pPr>
+        <w:pBdr/>
+        <w:spacing/>
+        <w:ind/>
+        <w:rPr>
           <w:lang w:val="fr-FR"/>
+        </w:rPr>
+      </w:pPr>
+      <w:r>
+        <w:rPr>
+          <w:highlight w:val="none"/>
+          <w:lang w:val="fr-FR" w:bidi="fr-FR"/>
+        </w:rPr>
+      </w:r>
+      <w:r>
+        <w:rPr>
+          <w:highlight w:val="none"/>
+          <w:lang w:val="fr-FR" w:bidi="fr-FR"/>
+        </w:rPr>
+        <w:tab/>
+      </w:r>
+      <w:r>
+        <w:rPr>
+          <w:highlight w:val="none"/>
+          <w:lang w:val="fr-FR" w:bidi="fr-FR"/>
+        </w:rPr>
+      </w:r>
+    </w:p>
+    <w:p>
+      <w:pPr>
+        <w:pBdr/>
+        <w:spacing/>
+        <w:ind/>
+        <w:rPr>
+          <w:lang w:val="fr-FR"/>
+        </w:rPr>
+      </w:pPr>
+      <w:r>
+        <w:rPr>
+          <w:highlight w:val="none"/>
+          <w:lang w:val="fr-FR" w:bidi="fr-FR"/>
+        </w:rPr>
+      </w:r>
+      <w:r>
+        <w:rPr>
+          <w:highlight w:val="none"/>
+          <w:lang w:val="fr-FR" w:bidi="fr-FR"/>
+        </w:rPr>
+      </w:r>
+      <w:r>
+        <w:rPr>
+          <w:highlight w:val="none"/>
+          <w:lang w:val="fr-FR" w:bidi="fr-FR"/>
         </w:rPr>
       </w:r>
     </w:p>

</xml_diff>

<commit_message>
Fix displayed and converted value in the main function.
</commit_message>
<xml_diff>
--- a/Documents/AnalyseFonctionnelle/Raphael Arseneault Analyse fonctionnelle et organique.docx
+++ b/Documents/AnalyseFonctionnelle/Raphael Arseneault Analyse fonctionnelle et organique.docx
@@ -1692,20 +1692,7 @@
           <w:highlight w:val="none"/>
           <w:lang w:val="fr-FR" w:bidi="fr-FR"/>
         </w:rPr>
-        <w:t xml:space="preserve">à la fin d’une instruction indiqué par un ; on continue ; ) </w:t>
-      </w:r>
-      <w:r/>
-      <w:r>
-        <w:rPr>
-          <w:highlight w:val="none"/>
-          <w:lang w:val="fr-FR" w:bidi="fr-FR"/>
-        </w:rPr>
-      </w:r>
-      <w:r>
-        <w:rPr>
-          <w:highlight w:val="none"/>
-          <w:lang w:val="fr-FR" w:bidi="fr-FR"/>
-        </w:rPr>
+        <w:t xml:space="preserve">à la fin d’une instruction indiqué par un ; on continue ; )</w:t>
       </w:r>
       <w:r>
         <w:rPr>
@@ -2763,6 +2750,7 @@
           <w:highlight w:val="none"/>
           <w:lang w:val="fr-FR" w:bidi="fr-FR"/>
         </w:rPr>
+        <w:t xml:space="preserve">Diagramme de classe </w:t>
       </w:r>
       <w:r>
         <w:rPr>

</xml_diff>